<commit_message>
Add batch biller option selection workflow
</commit_message>
<xml_diff>
--- a/cod_template.docx
+++ b/cod_template.docx
@@ -423,14 +423,17 @@
               </w:rPr>
               <w:t xml:space="preserve"> </w:t>
             </w:r>
-            <w:r>
-              <w:rPr>
+            <w:bookmarkStart w:id="0" w:name="_GoBack"/>
+            <w:bookmarkEnd w:id="0"/>
+            <w:r>
+              <w:rPr>
+                <w:rFonts w:hint="default"/>
                 <w:b/>
                 <w:spacing w:val="-2"/>
                 <w:sz w:val="34"/>
                 <w:lang w:val="en-GB"/>
               </w:rPr>
-              <w:t>1260357626</w:t>
+              <w:t>{{BILLER_ID}}</w:t>
             </w:r>
           </w:p>
         </w:tc>
@@ -663,8 +666,6 @@
               </w:rPr>
               <w:t xml:space="preserve"> (</w:t>
             </w:r>
-            <w:bookmarkStart w:id="0" w:name="_GoBack"/>
-            <w:bookmarkEnd w:id="0"/>
             <w:r>
               <w:rPr>
                 <w:rFonts w:hint="default"/>
@@ -949,7 +950,7 @@
     <w:lsdException w:qFormat="1" w:unhideWhenUsed="0" w:uiPriority="0" w:semiHidden="0" w:name="Title"/>
     <w:lsdException w:unhideWhenUsed="0" w:uiPriority="0" w:semiHidden="0" w:name="Closing"/>
     <w:lsdException w:unhideWhenUsed="0" w:uiPriority="0" w:semiHidden="0" w:name="Signature"/>
-    <w:lsdException w:unhideWhenUsed="0" w:uiPriority="0" w:name="Default Paragraph Font"/>
+    <w:lsdException w:qFormat="1" w:unhideWhenUsed="0" w:uiPriority="0" w:name="Default Paragraph Font"/>
     <w:lsdException w:unhideWhenUsed="0" w:uiPriority="0" w:semiHidden="0" w:name="Body Text"/>
     <w:lsdException w:unhideWhenUsed="0" w:uiPriority="0" w:semiHidden="0" w:name="Body Text Indent"/>
     <w:lsdException w:unhideWhenUsed="0" w:uiPriority="0" w:semiHidden="0" w:name="List Continue"/>
@@ -987,7 +988,7 @@
     <w:lsdException w:unhideWhenUsed="0" w:uiPriority="0" w:semiHidden="0" w:name="HTML Sample"/>
     <w:lsdException w:unhideWhenUsed="0" w:uiPriority="0" w:semiHidden="0" w:name="HTML Typewriter"/>
     <w:lsdException w:unhideWhenUsed="0" w:uiPriority="0" w:semiHidden="0" w:name="HTML Variable"/>
-    <w:lsdException w:unhideWhenUsed="0" w:uiPriority="0" w:name="Normal Table"/>
+    <w:lsdException w:qFormat="1" w:unhideWhenUsed="0" w:uiPriority="0" w:name="Normal Table"/>
     <w:lsdException w:unhideWhenUsed="0" w:uiPriority="0" w:semiHidden="0" w:name="annotation subject"/>
     <w:lsdException w:unhideWhenUsed="0" w:uiPriority="0" w:semiHidden="0" w:name="Table Simple 1"/>
     <w:lsdException w:unhideWhenUsed="0" w:uiPriority="0" w:semiHidden="0" w:name="Table Simple 2"/>
@@ -1155,11 +1156,13 @@
   <w:style w:type="character" w:default="1" w:styleId="2">
     <w:name w:val="Default Paragraph Font"/>
     <w:semiHidden/>
+    <w:qFormat/>
     <w:uiPriority w:val="0"/>
   </w:style>
   <w:style w:type="table" w:default="1" w:styleId="3">
     <w:name w:val="Normal Table"/>
     <w:semiHidden/>
+    <w:qFormat/>
     <w:uiPriority w:val="0"/>
     <w:tblPr>
       <w:tblCellMar>

</xml_diff>